<commit_message>
UD06/UD07: añade 5 diagramas Excalidraw y sustituye los ASCII que replican
</commit_message>
<xml_diff>
--- a/docx/06-trunking-inter-vlan/06-trunking-inter-vlan.docx
+++ b/docx/06-trunking-inter-vlan/06-trunking-inter-vlan.docx
@@ -1274,7 +1274,7 @@
     </w:p>
     <w:bookmarkEnd w:id="35"/>
     <w:bookmarkEnd w:id="36"/>
-    <w:bookmarkStart w:id="48" w:name="trunks-y-802.1q"/>
+    <w:bookmarkStart w:id="51" w:name="trunks-y-802.1q"/>
     <w:p>
       <w:pPr>
         <w:pStyle w:val="Heading1"/>
@@ -1914,7 +1914,7 @@
       </w:r>
     </w:p>
     <w:bookmarkEnd w:id="38"/>
-    <w:bookmarkStart w:id="39" w:name="qué-es-un-trunk"/>
+    <w:bookmarkStart w:id="42" w:name="qué-es-un-trunk"/>
     <w:p>
       <w:pPr>
         <w:pStyle w:val="Heading2"/>
@@ -1981,54 +1981,71 @@
     </w:p>
     <w:p>
       <w:pPr>
-        <w:pStyle w:val="SourceCode"/>
-      </w:pPr>
-      <w:r>
-        <w:rPr>
-          <w:rStyle w:val="VerbatimChar"/>
-        </w:rPr>
-        <w:t xml:space="preserve">Switch A (puerto Fa0/24, trunk) ──── Switch B (puerto Fa0/24, trunk)</w:t>
-      </w:r>
-      <w:r>
-        <w:br/>
-      </w:r>
-      <w:r>
-        <w:rPr>
-          <w:rStyle w:val="VerbatimChar"/>
-        </w:rPr>
-        <w:t xml:space="preserve">        │                                    │</w:t>
-      </w:r>
-      <w:r>
-        <w:br/>
-      </w:r>
-      <w:r>
-        <w:rPr>
-          <w:rStyle w:val="VerbatimChar"/>
-        </w:rPr>
-        <w:t xml:space="preserve">   VLAN 10 (Ventas)                    VLAN 10 (Ventas)</w:t>
-      </w:r>
-      <w:r>
-        <w:br/>
-      </w:r>
-      <w:r>
-        <w:rPr>
-          <w:rStyle w:val="VerbatimChar"/>
-        </w:rPr>
-        <w:t xml:space="preserve">   VLAN 20 (RRHH)                      VLAN 20 (RRHH)</w:t>
-      </w:r>
-      <w:r>
-        <w:br/>
-      </w:r>
-      <w:r>
-        <w:rPr>
-          <w:rStyle w:val="VerbatimChar"/>
-        </w:rPr>
-        <w:t xml:space="preserve">   VLAN 30 (IT)                        VLAN 30 (IT)</w:t>
-      </w:r>
-    </w:p>
-    <w:p>
-      <w:pPr>
-        <w:pStyle w:val="FirstParagraph"/>
+        <w:pStyle w:val="CaptionedFigure"/>
+      </w:pPr>
+      <w:r>
+        <w:drawing>
+          <wp:inline>
+            <wp:extent cx="5334000" cy="3081866"/>
+            <wp:effectExtent b="0" l="0" r="0" t="0"/>
+            <wp:docPr descr="Dos switches unidos por un trunk 802.1Q que transporta las VLANs 10, 20 y 30 etiquetadas; solo la native VLAN cruza sin etiqueta" title="" id="40" name="Picture"/>
+            <a:graphic>
+              <a:graphicData uri="http://schemas.openxmlformats.org/drawingml/2006/picture">
+                <pic:pic>
+                  <pic:nvPicPr>
+                    <pic:cNvPr descr="public/diagrams/u06-trunk-8021q.svg" id="41" name="Picture"/>
+                    <pic:cNvPicPr>
+                      <a:picLocks noChangeArrowheads="1" noChangeAspect="1"/>
+                    </pic:cNvPicPr>
+                  </pic:nvPicPr>
+                  <pic:blipFill>
+                    <a:blip>
+                      <a:extLst>
+                        <a:ext uri="{28A0092B-C50C-407E-A947-70E740481C1C}">
+                          <a14:useLocalDpi xmlns:a14="http://schemas.microsoft.com/office/drawing/2010/main" val="0"/>
+                        </a:ext>
+                        <a:ext uri="{96DAC541-7B7A-43D3-8B79-37D633B846F1}">
+                          <asvg:svgBlip xmlns:asvg="http://schemas.microsoft.com/office/drawing/2016/SVG/main" r:embed="rId39"/>
+                        </a:ext>
+                      </a:extLst>
+                    </a:blip>
+                    <a:stretch>
+                      <a:fillRect/>
+                    </a:stretch>
+                  </pic:blipFill>
+                  <pic:spPr bwMode="auto">
+                    <a:xfrm>
+                      <a:off x="0" y="0"/>
+                      <a:ext cx="5334000" cy="3081866"/>
+                    </a:xfrm>
+                    <a:prstGeom prst="rect">
+                      <a:avLst/>
+                    </a:prstGeom>
+                    <a:noFill/>
+                    <a:ln w="9525">
+                      <a:noFill/>
+                      <a:headEnd/>
+                      <a:tailEnd/>
+                    </a:ln>
+                  </pic:spPr>
+                </pic:pic>
+              </a:graphicData>
+            </a:graphic>
+          </wp:inline>
+        </w:drawing>
+      </w:r>
+    </w:p>
+    <w:p>
+      <w:pPr>
+        <w:pStyle w:val="ImageCaption"/>
+      </w:pPr>
+      <w:r>
+        <w:t xml:space="preserve">Dos switches unidos por un trunk 802.1Q que transporta las VLANs 10, 20 y 30 etiquetadas; solo la native VLAN cruza sin etiqueta</w:t>
+      </w:r>
+    </w:p>
+    <w:p>
+      <w:pPr>
+        <w:pStyle w:val="BodyText"/>
       </w:pPr>
       <w:r>
         <w:t xml:space="preserve">Sin el trunk, las VLANs de Ventas a un lado del edificio no llegarían a las del otro. Con él, un cable sostiene todas las VLANs del edificio. El mismo concepto se usa entre switch y router (</w:t>
@@ -2052,8 +2069,8 @@
         </w:pict>
       </w:r>
     </w:p>
-    <w:bookmarkEnd w:id="39"/>
-    <w:bookmarkStart w:id="40" w:name="configuración-de-un-trunk-en-cisco-ios"/>
+    <w:bookmarkEnd w:id="42"/>
+    <w:bookmarkStart w:id="43" w:name="configuración-de-un-trunk-en-cisco-ios"/>
     <w:p>
       <w:pPr>
         <w:pStyle w:val="Heading2"/>
@@ -2428,8 +2445,8 @@
         </w:pict>
       </w:r>
     </w:p>
-    <w:bookmarkEnd w:id="40"/>
-    <w:bookmarkStart w:id="42" w:name="la-native-vlan-la-que-viaja-sin-etiqueta"/>
+    <w:bookmarkEnd w:id="43"/>
+    <w:bookmarkStart w:id="45" w:name="la-native-vlan-la-que-viaja-sin-etiqueta"/>
     <w:p>
       <w:pPr>
         <w:pStyle w:val="Heading2"/>
@@ -2636,7 +2653,7 @@
         </w:tc>
       </w:tr>
     </w:tbl>
-    <w:bookmarkStart w:id="41" w:name="Xb807a0a831632592cf1a9f76759e919b8069559"/>
+    <w:bookmarkStart w:id="44" w:name="Xb807a0a831632592cf1a9f76759e919b8069559"/>
     <w:p>
       <w:pPr>
         <w:pStyle w:val="Heading3"/>
@@ -2867,9 +2884,9 @@
         </w:pict>
       </w:r>
     </w:p>
-    <w:bookmarkEnd w:id="41"/>
-    <w:bookmarkEnd w:id="42"/>
-    <w:bookmarkStart w:id="43" w:name="verificación-rápida"/>
+    <w:bookmarkEnd w:id="44"/>
+    <w:bookmarkEnd w:id="45"/>
+    <w:bookmarkStart w:id="46" w:name="verificación-rápida"/>
     <w:p>
       <w:pPr>
         <w:pStyle w:val="Heading2"/>
@@ -3004,8 +3021,8 @@
         </w:pict>
       </w:r>
     </w:p>
-    <w:bookmarkEnd w:id="43"/>
-    <w:bookmarkStart w:id="44" w:name="mini-chequeo"/>
+    <w:bookmarkEnd w:id="46"/>
+    <w:bookmarkStart w:id="47" w:name="mini-chequeo"/>
     <w:p>
       <w:pPr>
         <w:pStyle w:val="Heading2"/>
@@ -3253,8 +3270,8 @@
         </w:pict>
       </w:r>
     </w:p>
-    <w:bookmarkEnd w:id="44"/>
-    <w:bookmarkStart w:id="45" w:name="resumen-en-3-frases"/>
+    <w:bookmarkEnd w:id="47"/>
+    <w:bookmarkStart w:id="48" w:name="resumen-en-3-frases"/>
     <w:p>
       <w:pPr>
         <w:pStyle w:val="Heading2"/>
@@ -3403,8 +3420,8 @@
         <w:t xml:space="preserve">, y su desajuste es la incidencia clásica de los trunks.</w:t>
       </w:r>
     </w:p>
-    <w:bookmarkEnd w:id="45"/>
-    <w:bookmarkStart w:id="47" w:name="vocabulario-rápido"/>
+    <w:bookmarkEnd w:id="48"/>
+    <w:bookmarkStart w:id="50" w:name="vocabulario-rápido"/>
     <w:p>
       <w:pPr>
         <w:pStyle w:val="Heading2"/>
@@ -3630,7 +3647,7 @@
       <w:r>
         <w:t xml:space="preserve"> </w:t>
       </w:r>
-      <w:hyperlink r:id="rId46">
+      <w:hyperlink r:id="rId49">
         <w:r>
           <w:rPr>
             <w:rStyle w:val="Hyperlink"/>
@@ -3657,7 +3674,7 @@
       <w:r>
         <w:t xml:space="preserve"> </w:t>
       </w:r>
-      <w:hyperlink r:id="rId46">
+      <w:hyperlink r:id="rId49">
         <w:r>
           <w:rPr>
             <w:rStyle w:val="Hyperlink"/>
@@ -3693,9 +3710,9 @@
         </w:r>
       </w:hyperlink>
     </w:p>
-    <w:bookmarkEnd w:id="47"/>
-    <w:bookmarkEnd w:id="48"/>
-    <w:bookmarkStart w:id="62" w:name="configuración-y-verificación-de-trunks"/>
+    <w:bookmarkEnd w:id="50"/>
+    <w:bookmarkEnd w:id="51"/>
+    <w:bookmarkStart w:id="65" w:name="configuración-y-verificación-de-trunks"/>
     <w:p>
       <w:pPr>
         <w:pStyle w:val="Heading1"/>
@@ -3759,7 +3776,7 @@
         </w:pict>
       </w:r>
     </w:p>
-    <w:bookmarkStart w:id="49" w:name="la-idea-en-una-frase-1"/>
+    <w:bookmarkStart w:id="52" w:name="la-idea-en-una-frase-1"/>
     <w:p>
       <w:pPr>
         <w:pStyle w:val="Heading2"/>
@@ -3870,8 +3887,8 @@
         </w:pict>
       </w:r>
     </w:p>
-    <w:bookmarkEnd w:id="49"/>
-    <w:bookmarkStart w:id="50" w:name="el-escenario-departamental"/>
+    <w:bookmarkEnd w:id="52"/>
+    <w:bookmarkStart w:id="53" w:name="el-escenario-departamental"/>
     <w:p>
       <w:pPr>
         <w:pStyle w:val="Heading2"/>
@@ -4104,8 +4121,8 @@
         </w:pict>
       </w:r>
     </w:p>
-    <w:bookmarkEnd w:id="50"/>
-    <w:bookmarkStart w:id="51" w:name="paso-1-crear-las-vlans-en-switch1"/>
+    <w:bookmarkEnd w:id="53"/>
+    <w:bookmarkStart w:id="54" w:name="paso-1-crear-las-vlans-en-switch1"/>
     <w:p>
       <w:pPr>
         <w:pStyle w:val="Heading2"/>
@@ -4248,8 +4265,8 @@
         <w:t xml:space="preserve"># name RRHH</w:t>
       </w:r>
     </w:p>
-    <w:bookmarkEnd w:id="51"/>
-    <w:bookmarkStart w:id="52" w:name="paso-2-asignar-puertos-access"/>
+    <w:bookmarkEnd w:id="54"/>
+    <w:bookmarkStart w:id="55" w:name="paso-2-asignar-puertos-access"/>
     <w:p>
       <w:pPr>
         <w:pStyle w:val="Heading2"/>
@@ -4500,8 +4517,8 @@
         <w:t xml:space="preserve">cuando el tráfico del PC entra por Fa0/1. Al PC le da igual: ve una IP y un gateway normales.</w:t>
       </w:r>
     </w:p>
-    <w:bookmarkEnd w:id="52"/>
-    <w:bookmarkStart w:id="54" w:name="X58624124258261a73287975b8affb3bb427253c"/>
+    <w:bookmarkEnd w:id="55"/>
+    <w:bookmarkStart w:id="57" w:name="X58624124258261a73287975b8affb3bb427253c"/>
     <w:p>
       <w:pPr>
         <w:pStyle w:val="Heading2"/>
@@ -4652,7 +4669,7 @@
         <w:t xml:space="preserve"># switchport trunk allowed vlan 10,20</w:t>
       </w:r>
     </w:p>
-    <w:bookmarkStart w:id="53" w:name="el-fallo-intencionado-de-esta-unidad"/>
+    <w:bookmarkStart w:id="56" w:name="el-fallo-intencionado-de-esta-unidad"/>
     <w:p>
       <w:pPr>
         <w:pStyle w:val="Heading4"/>
@@ -4809,9 +4826,9 @@
         <w:t xml:space="preserve">y fuera de la 1.</w:t>
       </w:r>
     </w:p>
-    <w:bookmarkEnd w:id="53"/>
-    <w:bookmarkEnd w:id="54"/>
-    <w:bookmarkStart w:id="55" w:name="X4970cd4404108d0fd58c7121a5070a71a9a39d6"/>
+    <w:bookmarkEnd w:id="56"/>
+    <w:bookmarkEnd w:id="57"/>
+    <w:bookmarkStart w:id="58" w:name="X4970cd4404108d0fd58c7121a5070a71a9a39d6"/>
     <w:p>
       <w:pPr>
         <w:pStyle w:val="Heading2"/>
@@ -5224,8 +5241,8 @@
         <w:t xml:space="preserve"># switchport trunk allowed vlan 10,20</w:t>
       </w:r>
     </w:p>
-    <w:bookmarkEnd w:id="55"/>
-    <w:bookmarkStart w:id="56" w:name="paso-5-ips-en-los-pcs"/>
+    <w:bookmarkEnd w:id="58"/>
+    <w:bookmarkStart w:id="59" w:name="paso-5-ips-en-los-pcs"/>
     <w:p>
       <w:pPr>
         <w:pStyle w:val="Heading2"/>
@@ -5516,8 +5533,8 @@
         </w:pict>
       </w:r>
     </w:p>
-    <w:bookmarkEnd w:id="56"/>
-    <w:bookmarkStart w:id="57" w:name="kit-de-verificación-los-5-shows-de-oro"/>
+    <w:bookmarkEnd w:id="59"/>
+    <w:bookmarkStart w:id="60" w:name="kit-de-verificación-los-5-shows-de-oro"/>
     <w:p>
       <w:pPr>
         <w:pStyle w:val="Heading2"/>
@@ -5897,8 +5914,8 @@
         </w:pict>
       </w:r>
     </w:p>
-    <w:bookmarkEnd w:id="57"/>
-    <w:bookmarkStart w:id="58" w:name="plan-de-troubleshooting-rápido"/>
+    <w:bookmarkEnd w:id="60"/>
+    <w:bookmarkStart w:id="61" w:name="plan-de-troubleshooting-rápido"/>
     <w:p>
       <w:pPr>
         <w:pStyle w:val="Heading2"/>
@@ -6337,8 +6354,8 @@
         </w:pict>
       </w:r>
     </w:p>
-    <w:bookmarkEnd w:id="58"/>
-    <w:bookmarkStart w:id="59" w:name="mini-chequeo-1"/>
+    <w:bookmarkEnd w:id="61"/>
+    <w:bookmarkStart w:id="62" w:name="mini-chequeo-1"/>
     <w:p>
       <w:pPr>
         <w:pStyle w:val="Heading2"/>
@@ -6701,8 +6718,8 @@
         </w:pict>
       </w:r>
     </w:p>
-    <w:bookmarkEnd w:id="59"/>
-    <w:bookmarkStart w:id="60" w:name="resumen-en-3-frases-1"/>
+    <w:bookmarkEnd w:id="62"/>
+    <w:bookmarkStart w:id="63" w:name="resumen-en-3-frases-1"/>
     <w:p>
       <w:pPr>
         <w:pStyle w:val="Heading2"/>
@@ -6844,8 +6861,8 @@
         <w:t xml:space="preserve">.</w:t>
       </w:r>
     </w:p>
-    <w:bookmarkEnd w:id="60"/>
-    <w:bookmarkStart w:id="61" w:name="vocabulario-rápido-1"/>
+    <w:bookmarkEnd w:id="63"/>
+    <w:bookmarkStart w:id="64" w:name="vocabulario-rápido-1"/>
     <w:p>
       <w:pPr>
         <w:pStyle w:val="Heading2"/>
@@ -7052,7 +7069,7 @@
       <w:r>
         <w:t xml:space="preserve"> </w:t>
       </w:r>
-      <w:hyperlink r:id="rId46">
+      <w:hyperlink r:id="rId49">
         <w:r>
           <w:rPr>
             <w:rStyle w:val="Hyperlink"/>
@@ -7115,9 +7132,9 @@
         </w:r>
       </w:hyperlink>
     </w:p>
-    <w:bookmarkEnd w:id="61"/>
-    <w:bookmarkEnd w:id="62"/>
-    <w:bookmarkStart w:id="72" w:name="inter-vlan-routing"/>
+    <w:bookmarkEnd w:id="64"/>
+    <w:bookmarkEnd w:id="65"/>
+    <w:bookmarkStart w:id="78" w:name="inter-vlan-routing"/>
     <w:p>
       <w:pPr>
         <w:pStyle w:val="Heading1"/>
@@ -7181,7 +7198,7 @@
         </w:pict>
       </w:r>
     </w:p>
-    <w:bookmarkStart w:id="63" w:name="la-idea-en-una-frase-2"/>
+    <w:bookmarkStart w:id="66" w:name="la-idea-en-una-frase-2"/>
     <w:p>
       <w:pPr>
         <w:pStyle w:val="Heading2"/>
@@ -7268,8 +7285,8 @@
         </w:pict>
       </w:r>
     </w:p>
-    <w:bookmarkEnd w:id="63"/>
-    <w:bookmarkStart w:id="64" w:name="Xa9357948ebd001c7c925384f3ab8e2850f5023d"/>
+    <w:bookmarkEnd w:id="66"/>
+    <w:bookmarkStart w:id="70" w:name="Xa9357948ebd001c7c925384f3ab8e2850f5023d"/>
     <w:p>
       <w:pPr>
         <w:pStyle w:val="Heading2"/>
@@ -7358,90 +7375,71 @@
     </w:p>
     <w:p>
       <w:pPr>
-        <w:pStyle w:val="SourceCode"/>
-      </w:pPr>
-      <w:r>
-        <w:rPr>
-          <w:rStyle w:val="VerbatimChar"/>
-        </w:rPr>
-        <w:t xml:space="preserve">                    ┌─────────────┐</w:t>
-      </w:r>
-      <w:r>
-        <w:br/>
-      </w:r>
-      <w:r>
-        <w:rPr>
-          <w:rStyle w:val="VerbatimChar"/>
-        </w:rPr>
-        <w:t xml:space="preserve">                    │   ROUTER    │</w:t>
-      </w:r>
-      <w:r>
-        <w:br/>
-      </w:r>
-      <w:r>
-        <w:rPr>
-          <w:rStyle w:val="VerbatimChar"/>
-        </w:rPr>
-        <w:t xml:space="preserve">                    │ 10.1  20.1  │</w:t>
-      </w:r>
-      <w:r>
-        <w:br/>
-      </w:r>
-      <w:r>
-        <w:rPr>
-          <w:rStyle w:val="VerbatimChar"/>
-        </w:rPr>
-        <w:t xml:space="preserve">                    └──────┬──────┘</w:t>
-      </w:r>
-      <w:r>
-        <w:br/>
-      </w:r>
-      <w:r>
-        <w:rPr>
-          <w:rStyle w:val="VerbatimChar"/>
-        </w:rPr>
-        <w:t xml:space="preserve">                           │   [trunk 802.1Q]</w:t>
-      </w:r>
-      <w:r>
-        <w:br/>
-      </w:r>
-      <w:r>
-        <w:rPr>
-          <w:rStyle w:val="VerbatimChar"/>
-        </w:rPr>
-        <w:t xml:space="preserve">                    ┌──────┴──────┐</w:t>
-      </w:r>
-      <w:r>
-        <w:br/>
-      </w:r>
-      <w:r>
-        <w:rPr>
-          <w:rStyle w:val="VerbatimChar"/>
-        </w:rPr>
-        <w:t xml:space="preserve">                    │   SWITCH    │</w:t>
-      </w:r>
-      <w:r>
-        <w:br/>
-      </w:r>
-      <w:r>
-        <w:rPr>
-          <w:rStyle w:val="VerbatimChar"/>
-        </w:rPr>
-        <w:t xml:space="preserve">              VLAN 10└──┐     ┌──┘VLAN 20</w:t>
-      </w:r>
-      <w:r>
-        <w:br/>
-      </w:r>
-      <w:r>
-        <w:rPr>
-          <w:rStyle w:val="VerbatimChar"/>
-        </w:rPr>
-        <w:t xml:space="preserve">                  Ventas │     │ RRHH</w:t>
-      </w:r>
-    </w:p>
-    <w:p>
-      <w:pPr>
-        <w:pStyle w:val="FirstParagraph"/>
+        <w:pStyle w:val="CaptionedFigure"/>
+      </w:pPr>
+      <w:r>
+        <w:drawing>
+          <wp:inline>
+            <wp:extent cx="5334000" cy="4093534"/>
+            <wp:effectExtent b="0" l="0" r="0" t="0"/>
+            <wp:docPr descr="Router-on-a-stick: el router con subinterfaz por VLAN conectado al switch por un trunk 802.1Q, con PCs de Ventas y RRHH detrás" title="" id="68" name="Picture"/>
+            <a:graphic>
+              <a:graphicData uri="http://schemas.openxmlformats.org/drawingml/2006/picture">
+                <pic:pic>
+                  <pic:nvPicPr>
+                    <pic:cNvPr descr="public/diagrams/u06-router-on-a-stick.svg" id="69" name="Picture"/>
+                    <pic:cNvPicPr>
+                      <a:picLocks noChangeArrowheads="1" noChangeAspect="1"/>
+                    </pic:cNvPicPr>
+                  </pic:nvPicPr>
+                  <pic:blipFill>
+                    <a:blip>
+                      <a:extLst>
+                        <a:ext uri="{28A0092B-C50C-407E-A947-70E740481C1C}">
+                          <a14:useLocalDpi xmlns:a14="http://schemas.microsoft.com/office/drawing/2010/main" val="0"/>
+                        </a:ext>
+                        <a:ext uri="{96DAC541-7B7A-43D3-8B79-37D633B846F1}">
+                          <asvg:svgBlip xmlns:asvg="http://schemas.microsoft.com/office/drawing/2016/SVG/main" r:embed="rId67"/>
+                        </a:ext>
+                      </a:extLst>
+                    </a:blip>
+                    <a:stretch>
+                      <a:fillRect/>
+                    </a:stretch>
+                  </pic:blipFill>
+                  <pic:spPr bwMode="auto">
+                    <a:xfrm>
+                      <a:off x="0" y="0"/>
+                      <a:ext cx="5334000" cy="4093534"/>
+                    </a:xfrm>
+                    <a:prstGeom prst="rect">
+                      <a:avLst/>
+                    </a:prstGeom>
+                    <a:noFill/>
+                    <a:ln w="9525">
+                      <a:noFill/>
+                      <a:headEnd/>
+                      <a:tailEnd/>
+                    </a:ln>
+                  </pic:spPr>
+                </pic:pic>
+              </a:graphicData>
+            </a:graphic>
+          </wp:inline>
+        </w:drawing>
+      </w:r>
+    </w:p>
+    <w:p>
+      <w:pPr>
+        <w:pStyle w:val="ImageCaption"/>
+      </w:pPr>
+      <w:r>
+        <w:t xml:space="preserve">Router-on-a-stick: el router con subinterfaz por VLAN conectado al switch por un trunk 802.1Q, con PCs de Ventas y RRHH detrás</w:t>
+      </w:r>
+    </w:p>
+    <w:p>
+      <w:pPr>
+        <w:pStyle w:val="BodyText"/>
       </w:pPr>
       <w:r>
         <w:t xml:space="preserve">Cuando el PC de Ventas quiere hablar con RRHH:</w:t>
@@ -7590,8 +7588,8 @@
         </w:pict>
       </w:r>
     </w:p>
-    <w:bookmarkEnd w:id="64"/>
-    <w:bookmarkStart w:id="65" w:name="X5ea81d6d2469005a24f5a6a44db83098885ccc0"/>
+    <w:bookmarkEnd w:id="70"/>
+    <w:bookmarkStart w:id="71" w:name="X5ea81d6d2469005a24f5a6a44db83098885ccc0"/>
     <w:p>
       <w:pPr>
         <w:pStyle w:val="Heading2"/>
@@ -7706,72 +7704,7 @@
     </w:p>
     <w:p>
       <w:pPr>
-        <w:pStyle w:val="SourceCode"/>
-      </w:pPr>
-      <w:r>
-        <w:rPr>
-          <w:rStyle w:val="VerbatimChar"/>
-        </w:rPr>
-        <w:t xml:space="preserve">Router Fa0/0.10 → VLAN 10 (192.168.10.1/24)</w:t>
-      </w:r>
-      <w:r>
-        <w:br/>
-      </w:r>
-      <w:r>
-        <w:rPr>
-          <w:rStyle w:val="VerbatimChar"/>
-        </w:rPr>
-        <w:t xml:space="preserve">Router Fa0/0.20 → VLAN 20 (192.168.20.1/24)</w:t>
-      </w:r>
-      <w:r>
-        <w:br/>
-      </w:r>
-      <w:r>
-        <w:rPr>
-          <w:rStyle w:val="VerbatimChar"/>
-        </w:rPr>
-        <w:t xml:space="preserve">Router Fa0/0.30 → VLAN 30 (192.168.30.1/24)</w:t>
-      </w:r>
-      <w:r>
-        <w:br/>
-      </w:r>
-      <w:r>
-        <w:rPr>
-          <w:rStyle w:val="VerbatimChar"/>
-        </w:rPr>
-        <w:t xml:space="preserve">         │</w:t>
-      </w:r>
-      <w:r>
-        <w:br/>
-      </w:r>
-      <w:r>
-        <w:rPr>
-          <w:rStyle w:val="VerbatimChar"/>
-        </w:rPr>
-        <w:t xml:space="preserve">      [Trunk 802.1Q]</w:t>
-      </w:r>
-      <w:r>
-        <w:br/>
-      </w:r>
-      <w:r>
-        <w:rPr>
-          <w:rStyle w:val="VerbatimChar"/>
-        </w:rPr>
-        <w:t xml:space="preserve">         │</w:t>
-      </w:r>
-      <w:r>
-        <w:br/>
-      </w:r>
-      <w:r>
-        <w:rPr>
-          <w:rStyle w:val="VerbatimChar"/>
-        </w:rPr>
-        <w:t xml:space="preserve">      [Switch]</w:t>
-      </w:r>
-    </w:p>
-    <w:p>
-      <w:pPr>
-        <w:pStyle w:val="FirstParagraph"/>
+        <w:pStyle w:val="BodyText"/>
       </w:pPr>
       <w:r>
         <w:t xml:space="preserve">Ventajas: mínimo hardware (un puerto), fácil de entender y perfecto para redes pequeñas. Desventaja:</w:t>
@@ -7814,8 +7747,8 @@
         </w:pict>
       </w:r>
     </w:p>
-    <w:bookmarkEnd w:id="65"/>
-    <w:bookmarkStart w:id="66" w:name="Xf0c16decffb477f2977d916272e039f1f5345d2"/>
+    <w:bookmarkEnd w:id="71"/>
+    <w:bookmarkStart w:id="72" w:name="Xf0c16decffb477f2977d916272e039f1f5345d2"/>
     <w:p>
       <w:pPr>
         <w:pStyle w:val="Heading2"/>
@@ -8501,8 +8434,8 @@
         </w:pict>
       </w:r>
     </w:p>
-    <w:bookmarkEnd w:id="66"/>
-    <w:bookmarkStart w:id="67" w:name="X63b5957278e57460513bd60dea0cc0664c5ad01"/>
+    <w:bookmarkEnd w:id="72"/>
+    <w:bookmarkStart w:id="73" w:name="X63b5957278e57460513bd60dea0cc0664c5ad01"/>
     <w:p>
       <w:pPr>
         <w:pStyle w:val="Heading2"/>
@@ -8794,8 +8727,8 @@
         </w:pict>
       </w:r>
     </w:p>
-    <w:bookmarkEnd w:id="67"/>
-    <w:bookmarkStart w:id="68" w:name="verificación"/>
+    <w:bookmarkEnd w:id="73"/>
+    <w:bookmarkStart w:id="74" w:name="verificación"/>
     <w:p>
       <w:pPr>
         <w:pStyle w:val="Heading2"/>
@@ -8946,8 +8879,8 @@
         </w:pict>
       </w:r>
     </w:p>
-    <w:bookmarkEnd w:id="68"/>
-    <w:bookmarkStart w:id="69" w:name="mini-chequeo-2"/>
+    <w:bookmarkEnd w:id="74"/>
+    <w:bookmarkStart w:id="75" w:name="mini-chequeo-2"/>
     <w:p>
       <w:pPr>
         <w:pStyle w:val="Heading2"/>
@@ -9147,8 +9080,8 @@
         </w:pict>
       </w:r>
     </w:p>
-    <w:bookmarkEnd w:id="69"/>
-    <w:bookmarkStart w:id="70" w:name="resumen-en-3-frases-2"/>
+    <w:bookmarkEnd w:id="75"/>
+    <w:bookmarkStart w:id="76" w:name="resumen-en-3-frases-2"/>
     <w:p>
       <w:pPr>
         <w:pStyle w:val="Heading2"/>
@@ -9279,8 +9212,8 @@
         <w:t xml:space="preserve">Cada PC apunta a su gateway (la subinterfaz) y todo el tráfico entre VLANs atraviesa la misma interfaz: su cuello de botella.</w:t>
       </w:r>
     </w:p>
-    <w:bookmarkEnd w:id="70"/>
-    <w:bookmarkStart w:id="71" w:name="vocabulario-rápido-2"/>
+    <w:bookmarkEnd w:id="76"/>
+    <w:bookmarkStart w:id="77" w:name="vocabulario-rápido-2"/>
     <w:p>
       <w:pPr>
         <w:pStyle w:val="Heading2"/>
@@ -9520,7 +9453,7 @@
       <w:r>
         <w:t xml:space="preserve"> </w:t>
       </w:r>
-      <w:hyperlink r:id="rId46">
+      <w:hyperlink r:id="rId49">
         <w:r>
           <w:rPr>
             <w:rStyle w:val="Hyperlink"/>
@@ -9583,9 +9516,9 @@
         </w:r>
       </w:hyperlink>
     </w:p>
-    <w:bookmarkEnd w:id="71"/>
-    <w:bookmarkEnd w:id="72"/>
-    <w:bookmarkStart w:id="81" w:name="switch-capa-3-y-svis"/>
+    <w:bookmarkEnd w:id="77"/>
+    <w:bookmarkEnd w:id="78"/>
+    <w:bookmarkStart w:id="87" w:name="switch-capa-3-y-svis"/>
     <w:p>
       <w:pPr>
         <w:pStyle w:val="Heading1"/>
@@ -9649,7 +9582,7 @@
         </w:pict>
       </w:r>
     </w:p>
-    <w:bookmarkStart w:id="73" w:name="la-idea-en-una-frase-3"/>
+    <w:bookmarkStart w:id="79" w:name="la-idea-en-una-frase-3"/>
     <w:p>
       <w:pPr>
         <w:pStyle w:val="Heading2"/>
@@ -9778,8 +9711,8 @@
         </w:pict>
       </w:r>
     </w:p>
-    <w:bookmarkEnd w:id="73"/>
-    <w:bookmarkStart w:id="74" w:name="las-dos-caras-de-un-switch-capa-3"/>
+    <w:bookmarkEnd w:id="79"/>
+    <w:bookmarkStart w:id="80" w:name="las-dos-caras-de-un-switch-capa-3"/>
     <w:p>
       <w:pPr>
         <w:pStyle w:val="Heading2"/>
@@ -10037,8 +9970,8 @@
         </w:pict>
       </w:r>
     </w:p>
-    <w:bookmarkEnd w:id="74"/>
-    <w:bookmarkStart w:id="75" w:name="svi-la-interfaz-virtual-de-una-vlan"/>
+    <w:bookmarkEnd w:id="80"/>
+    <w:bookmarkStart w:id="81" w:name="svi-la-interfaz-virtual-de-una-vlan"/>
     <w:p>
       <w:pPr>
         <w:pStyle w:val="Heading2"/>
@@ -10913,8 +10846,8 @@
         </w:pict>
       </w:r>
     </w:p>
-    <w:bookmarkEnd w:id="75"/>
-    <w:bookmarkStart w:id="76" w:name="switch-capa-3-vs-router-on-a-stick"/>
+    <w:bookmarkEnd w:id="81"/>
+    <w:bookmarkStart w:id="82" w:name="switch-capa-3-vs-router-on-a-stick"/>
     <w:p>
       <w:pPr>
         <w:pStyle w:val="Heading2"/>
@@ -11290,8 +11223,8 @@
         </w:pict>
       </w:r>
     </w:p>
-    <w:bookmarkEnd w:id="76"/>
-    <w:bookmarkStart w:id="77" w:name="X7e812ea070b1b2e0af8c4bac22a5a571f60ac2d"/>
+    <w:bookmarkEnd w:id="82"/>
+    <w:bookmarkStart w:id="83" w:name="X7e812ea070b1b2e0af8c4bac22a5a571f60ac2d"/>
     <w:p>
       <w:pPr>
         <w:pStyle w:val="Heading2"/>
@@ -11487,8 +11420,8 @@
         </w:pict>
       </w:r>
     </w:p>
-    <w:bookmarkEnd w:id="77"/>
-    <w:bookmarkStart w:id="78" w:name="mini-chequeo-3"/>
+    <w:bookmarkEnd w:id="83"/>
+    <w:bookmarkStart w:id="84" w:name="mini-chequeo-3"/>
     <w:p>
       <w:pPr>
         <w:pStyle w:val="Heading2"/>
@@ -11680,8 +11613,8 @@
         </w:pict>
       </w:r>
     </w:p>
-    <w:bookmarkEnd w:id="78"/>
-    <w:bookmarkStart w:id="79" w:name="resumen-en-3-frases-3"/>
+    <w:bookmarkEnd w:id="84"/>
+    <w:bookmarkStart w:id="85" w:name="resumen-en-3-frases-3"/>
     <w:p>
       <w:pPr>
         <w:pStyle w:val="Heading2"/>
@@ -11795,8 +11728,8 @@
         <w:t xml:space="preserve">Úsalo cuando el número de VLANs o el tráfico entre ellas sea grande; el router-on-a-stick basta para oficinas pequeñas.</w:t>
       </w:r>
     </w:p>
-    <w:bookmarkEnd w:id="79"/>
-    <w:bookmarkStart w:id="80" w:name="vocabulario-rápido-3"/>
+    <w:bookmarkEnd w:id="85"/>
+    <w:bookmarkStart w:id="86" w:name="vocabulario-rápido-3"/>
     <w:p>
       <w:pPr>
         <w:pStyle w:val="Heading2"/>
@@ -11997,7 +11930,7 @@
       <w:r>
         <w:t xml:space="preserve"> </w:t>
       </w:r>
-      <w:hyperlink r:id="rId46">
+      <w:hyperlink r:id="rId49">
         <w:r>
           <w:rPr>
             <w:rStyle w:val="Hyperlink"/>
@@ -12060,9 +11993,9 @@
         </w:r>
       </w:hyperlink>
     </w:p>
-    <w:bookmarkEnd w:id="80"/>
-    <w:bookmarkEnd w:id="81"/>
-    <w:bookmarkStart w:id="93" w:name="vtp-y-dtp"/>
+    <w:bookmarkEnd w:id="86"/>
+    <w:bookmarkEnd w:id="87"/>
+    <w:bookmarkStart w:id="99" w:name="vtp-y-dtp"/>
     <w:p>
       <w:pPr>
         <w:pStyle w:val="Heading1"/>
@@ -12126,7 +12059,7 @@
         </w:pict>
       </w:r>
     </w:p>
-    <w:bookmarkStart w:id="82" w:name="la-idea-en-una-frase-4"/>
+    <w:bookmarkStart w:id="88" w:name="la-idea-en-una-frase-4"/>
     <w:p>
       <w:pPr>
         <w:pStyle w:val="Heading2"/>
@@ -12232,8 +12165,8 @@
         </w:pict>
       </w:r>
     </w:p>
-    <w:bookmarkEnd w:id="82"/>
-    <w:bookmarkStart w:id="86" w:name="vtp-el-repartidor-de-vlans"/>
+    <w:bookmarkEnd w:id="88"/>
+    <w:bookmarkStart w:id="92" w:name="vtp-el-repartidor-de-vlans"/>
     <w:p>
       <w:pPr>
         <w:pStyle w:val="Heading2"/>
@@ -12268,7 +12201,7 @@
         <w:t xml:space="preserve">(server) al resto (clients). Cuando creas la VLAN 40 en el server, todos los switches de la red la aprenden solos por el trunk.</w:t>
       </w:r>
     </w:p>
-    <w:bookmarkStart w:id="83" w:name="los-tres-modos-vtp"/>
+    <w:bookmarkStart w:id="89" w:name="los-tres-modos-vtp"/>
     <w:p>
       <w:pPr>
         <w:pStyle w:val="Heading3"/>
@@ -12672,8 +12605,8 @@
         <w:t xml:space="preserve">es el recomendado: no envía ni procesa anuncios VTP en absoluto.</w:t>
       </w:r>
     </w:p>
-    <w:bookmarkEnd w:id="83"/>
-    <w:bookmarkStart w:id="84" w:name="Xd373e7eb1af6a25a7e774435953febb978e7c92"/>
+    <w:bookmarkEnd w:id="89"/>
+    <w:bookmarkStart w:id="90" w:name="Xd373e7eb1af6a25a7e774435953febb978e7c92"/>
     <w:p>
       <w:pPr>
         <w:pStyle w:val="Heading3"/>
@@ -12884,8 +12817,8 @@
         <w:t xml:space="preserve">”</w:t>
       </w:r>
     </w:p>
-    <w:bookmarkEnd w:id="84"/>
-    <w:bookmarkStart w:id="85" w:name="cómo-evitar-el-desastre"/>
+    <w:bookmarkEnd w:id="90"/>
+    <w:bookmarkStart w:id="91" w:name="cómo-evitar-el-desastre"/>
     <w:p>
       <w:pPr>
         <w:pStyle w:val="Heading3"/>
@@ -13018,9 +12951,9 @@
         </w:pict>
       </w:r>
     </w:p>
-    <w:bookmarkEnd w:id="85"/>
-    <w:bookmarkEnd w:id="86"/>
-    <w:bookmarkStart w:id="88" w:name="dtp-el-negociador-de-trunks"/>
+    <w:bookmarkEnd w:id="91"/>
+    <w:bookmarkEnd w:id="92"/>
+    <w:bookmarkStart w:id="94" w:name="dtp-el-negociador-de-trunks"/>
     <w:p>
       <w:pPr>
         <w:pStyle w:val="Heading2"/>
@@ -13330,7 +13263,7 @@
         </w:tc>
       </w:tr>
     </w:tbl>
-    <w:bookmarkStart w:id="87" w:name="el-riesgo-de-seguridad-de-dtp"/>
+    <w:bookmarkStart w:id="93" w:name="el-riesgo-de-seguridad-de-dtp"/>
     <w:p>
       <w:pPr>
         <w:pStyle w:val="Heading3"/>
@@ -13553,9 +13486,9 @@
         </w:pict>
       </w:r>
     </w:p>
-    <w:bookmarkEnd w:id="87"/>
-    <w:bookmarkEnd w:id="88"/>
-    <w:bookmarkStart w:id="89" w:name="verificación-y-comandos"/>
+    <w:bookmarkEnd w:id="93"/>
+    <w:bookmarkEnd w:id="94"/>
+    <w:bookmarkStart w:id="95" w:name="verificación-y-comandos"/>
     <w:p>
       <w:pPr>
         <w:pStyle w:val="Heading2"/>
@@ -13718,8 +13651,8 @@
         </w:pict>
       </w:r>
     </w:p>
-    <w:bookmarkEnd w:id="89"/>
-    <w:bookmarkStart w:id="90" w:name="mini-chequeo-4"/>
+    <w:bookmarkEnd w:id="95"/>
+    <w:bookmarkStart w:id="96" w:name="mini-chequeo-4"/>
     <w:p>
       <w:pPr>
         <w:pStyle w:val="Heading2"/>
@@ -13977,8 +13910,8 @@
         </w:pict>
       </w:r>
     </w:p>
-    <w:bookmarkEnd w:id="90"/>
-    <w:bookmarkStart w:id="91" w:name="resumen-en-3-frases-4"/>
+    <w:bookmarkEnd w:id="96"/>
+    <w:bookmarkStart w:id="97" w:name="resumen-en-3-frases-4"/>
     <w:p>
       <w:pPr>
         <w:pStyle w:val="Heading2"/>
@@ -14118,8 +14051,8 @@
         <w:t xml:space="preserve">en todos los trunks.</w:t>
       </w:r>
     </w:p>
-    <w:bookmarkEnd w:id="91"/>
-    <w:bookmarkStart w:id="92" w:name="vocabulario-rápido-4"/>
+    <w:bookmarkEnd w:id="97"/>
+    <w:bookmarkStart w:id="98" w:name="vocabulario-rápido-4"/>
     <w:p>
       <w:pPr>
         <w:pStyle w:val="Heading2"/>
@@ -14346,7 +14279,7 @@
       <w:r>
         <w:t xml:space="preserve"> </w:t>
       </w:r>
-      <w:hyperlink r:id="rId46">
+      <w:hyperlink r:id="rId49">
         <w:r>
           <w:rPr>
             <w:rStyle w:val="Hyperlink"/>
@@ -14409,9 +14342,9 @@
         </w:r>
       </w:hyperlink>
     </w:p>
-    <w:bookmarkEnd w:id="92"/>
-    <w:bookmarkEnd w:id="93"/>
-    <w:bookmarkStart w:id="102" w:name="seguridad-en-vlans"/>
+    <w:bookmarkEnd w:id="98"/>
+    <w:bookmarkEnd w:id="99"/>
+    <w:bookmarkStart w:id="108" w:name="seguridad-en-vlans"/>
     <w:p>
       <w:pPr>
         <w:pStyle w:val="Heading1"/>
@@ -14475,7 +14408,7 @@
         </w:pict>
       </w:r>
     </w:p>
-    <w:bookmarkStart w:id="94" w:name="la-idea-en-una-frase-5"/>
+    <w:bookmarkStart w:id="100" w:name="la-idea-en-una-frase-5"/>
     <w:p>
       <w:pPr>
         <w:pStyle w:val="Heading2"/>
@@ -14568,8 +14501,8 @@
         </w:pict>
       </w:r>
     </w:p>
-    <w:bookmarkEnd w:id="94"/>
-    <w:bookmarkStart w:id="95" w:name="vacl-el-filtro-dentro-de-la-vlan"/>
+    <w:bookmarkEnd w:id="100"/>
+    <w:bookmarkStart w:id="101" w:name="vacl-el-filtro-dentro-de-la-vlan"/>
     <w:p>
       <w:pPr>
         <w:pStyle w:val="Heading2"/>
@@ -15182,8 +15115,8 @@
         </w:pict>
       </w:r>
     </w:p>
-    <w:bookmarkEnd w:id="95"/>
-    <w:bookmarkStart w:id="96" w:name="X41e7f841a808ffd09581170b3dfda91df0d9233"/>
+    <w:bookmarkEnd w:id="101"/>
+    <w:bookmarkStart w:id="102" w:name="X41e7f841a808ffd09581170b3dfda91df0d9233"/>
     <w:p>
       <w:pPr>
         <w:pStyle w:val="Heading2"/>
@@ -15505,8 +15438,8 @@
         </w:pict>
       </w:r>
     </w:p>
-    <w:bookmarkEnd w:id="96"/>
-    <w:bookmarkStart w:id="97" w:name="vlan-hopping-el-salto-de-vlan"/>
+    <w:bookmarkEnd w:id="102"/>
+    <w:bookmarkStart w:id="103" w:name="vlan-hopping-el-salto-de-vlan"/>
     <w:p>
       <w:pPr>
         <w:pStyle w:val="Heading2"/>
@@ -15814,8 +15747,8 @@
         </w:pict>
       </w:r>
     </w:p>
-    <w:bookmarkEnd w:id="97"/>
-    <w:bookmarkStart w:id="98" w:name="hardening-básico-de-vlans-checklist"/>
+    <w:bookmarkEnd w:id="103"/>
+    <w:bookmarkStart w:id="104" w:name="hardening-básico-de-vlans-checklist"/>
     <w:p>
       <w:pPr>
         <w:pStyle w:val="Heading2"/>
@@ -16550,8 +16483,8 @@
         </w:pict>
       </w:r>
     </w:p>
-    <w:bookmarkEnd w:id="98"/>
-    <w:bookmarkStart w:id="99" w:name="mini-chequeo-5"/>
+    <w:bookmarkEnd w:id="104"/>
+    <w:bookmarkStart w:id="105" w:name="mini-chequeo-5"/>
     <w:p>
       <w:pPr>
         <w:pStyle w:val="Heading2"/>
@@ -16779,8 +16712,8 @@
         </w:pict>
       </w:r>
     </w:p>
-    <w:bookmarkEnd w:id="99"/>
-    <w:bookmarkStart w:id="100" w:name="resumen-en-3-frases-5"/>
+    <w:bookmarkEnd w:id="105"/>
+    <w:bookmarkStart w:id="106" w:name="resumen-en-3-frases-5"/>
     <w:p>
       <w:pPr>
         <w:pStyle w:val="Heading2"/>
@@ -16889,8 +16822,8 @@
         <w:t xml:space="preserve">en 9 pasos (access, nonegotiate, native alta, VLAN 1 prohibida, gestión aparte, sin VTP) cierra los frentes clásicos.</w:t>
       </w:r>
     </w:p>
-    <w:bookmarkEnd w:id="100"/>
-    <w:bookmarkStart w:id="101" w:name="vocabulario-rápido-5"/>
+    <w:bookmarkEnd w:id="106"/>
+    <w:bookmarkStart w:id="107" w:name="vocabulario-rápido-5"/>
     <w:p>
       <w:pPr>
         <w:pStyle w:val="Heading2"/>
@@ -17114,7 +17047,7 @@
       <w:r>
         <w:t xml:space="preserve"> </w:t>
       </w:r>
-      <w:hyperlink r:id="rId46">
+      <w:hyperlink r:id="rId49">
         <w:r>
           <w:rPr>
             <w:rStyle w:val="Hyperlink"/>
@@ -17177,9 +17110,9 @@
         </w:r>
       </w:hyperlink>
     </w:p>
-    <w:bookmarkEnd w:id="101"/>
-    <w:bookmarkEnd w:id="102"/>
-    <w:bookmarkStart w:id="112" w:name="dhcp-por-vlan"/>
+    <w:bookmarkEnd w:id="107"/>
+    <w:bookmarkEnd w:id="108"/>
+    <w:bookmarkStart w:id="118" w:name="dhcp-por-vlan"/>
     <w:p>
       <w:pPr>
         <w:pStyle w:val="Heading1"/>
@@ -17243,7 +17176,7 @@
         </w:pict>
       </w:r>
     </w:p>
-    <w:bookmarkStart w:id="104" w:name="la-idea-en-una-frase-6"/>
+    <w:bookmarkStart w:id="110" w:name="la-idea-en-una-frase-6"/>
     <w:p>
       <w:pPr>
         <w:pStyle w:val="Heading2"/>
@@ -17299,7 +17232,7 @@
       <w:r>
         <w:t xml:space="preserve"> </w:t>
       </w:r>
-      <w:hyperlink r:id="rId103">
+      <w:hyperlink r:id="rId109">
         <w:r>
           <w:rPr>
             <w:rStyle w:val="Hyperlink"/>
@@ -17443,8 +17376,8 @@
         </w:pict>
       </w:r>
     </w:p>
-    <w:bookmarkEnd w:id="104"/>
-    <w:bookmarkStart w:id="105" w:name="el-montaje-un-pool-por-subred"/>
+    <w:bookmarkEnd w:id="110"/>
+    <w:bookmarkStart w:id="111" w:name="el-montaje-un-pool-por-subred"/>
     <w:p>
       <w:pPr>
         <w:pStyle w:val="Heading2"/>
@@ -18130,8 +18063,8 @@
         </w:pict>
       </w:r>
     </w:p>
-    <w:bookmarkEnd w:id="105"/>
-    <w:bookmarkStart w:id="106" w:name="X63088753742bef018f1ef391bb3185aa584431d"/>
+    <w:bookmarkEnd w:id="111"/>
+    <w:bookmarkStart w:id="112" w:name="X63088753742bef018f1ef391bb3185aa584431d"/>
     <w:p>
       <w:pPr>
         <w:pStyle w:val="Heading2"/>
@@ -18433,8 +18366,8 @@
         </w:pict>
       </w:r>
     </w:p>
-    <w:bookmarkEnd w:id="106"/>
-    <w:bookmarkStart w:id="107" w:name="verificación-1"/>
+    <w:bookmarkEnd w:id="112"/>
+    <w:bookmarkStart w:id="113" w:name="verificación-1"/>
     <w:p>
       <w:pPr>
         <w:pStyle w:val="Heading2"/>
@@ -18690,8 +18623,8 @@
         </w:pict>
       </w:r>
     </w:p>
-    <w:bookmarkEnd w:id="107"/>
-    <w:bookmarkStart w:id="108" w:name="X89659d3ef707d7e7f1f08d28fde977cb380da89"/>
+    <w:bookmarkEnd w:id="113"/>
+    <w:bookmarkStart w:id="114" w:name="X89659d3ef707d7e7f1f08d28fde977cb380da89"/>
     <w:p>
       <w:pPr>
         <w:pStyle w:val="Heading2"/>
@@ -18877,8 +18810,8 @@
         </w:pict>
       </w:r>
     </w:p>
-    <w:bookmarkEnd w:id="108"/>
-    <w:bookmarkStart w:id="109" w:name="mini-chequeo-6"/>
+    <w:bookmarkEnd w:id="114"/>
+    <w:bookmarkStart w:id="115" w:name="mini-chequeo-6"/>
     <w:p>
       <w:pPr>
         <w:pStyle w:val="Heading2"/>
@@ -19053,8 +18986,8 @@
         </w:pict>
       </w:r>
     </w:p>
-    <w:bookmarkEnd w:id="109"/>
-    <w:bookmarkStart w:id="110" w:name="resumen-en-3-frases-6"/>
+    <w:bookmarkEnd w:id="115"/>
+    <w:bookmarkStart w:id="116" w:name="resumen-en-3-frases-6"/>
     <w:p>
       <w:pPr>
         <w:pStyle w:val="Heading2"/>
@@ -19164,8 +19097,8 @@
         <w:t xml:space="preserve">El PC en APIPA (169.254.x.x) es la señal de que algo falla en la cadena pool → VLAN → relay, y con Wireshark se ve en qué eslabón.</w:t>
       </w:r>
     </w:p>
-    <w:bookmarkEnd w:id="110"/>
-    <w:bookmarkStart w:id="111" w:name="vocabulario-rápido-6"/>
+    <w:bookmarkEnd w:id="116"/>
+    <w:bookmarkStart w:id="117" w:name="vocabulario-rápido-6"/>
     <w:p>
       <w:pPr>
         <w:pStyle w:val="Heading2"/>
@@ -19384,7 +19317,7 @@
       <w:r>
         <w:t xml:space="preserve"> </w:t>
       </w:r>
-      <w:hyperlink r:id="rId46">
+      <w:hyperlink r:id="rId49">
         <w:r>
           <w:rPr>
             <w:rStyle w:val="Hyperlink"/>
@@ -19447,9 +19380,9 @@
         </w:r>
       </w:hyperlink>
     </w:p>
-    <w:bookmarkEnd w:id="111"/>
-    <w:bookmarkEnd w:id="112"/>
-    <w:bookmarkStart w:id="125" w:name="cierre-consolida-lo-aprendido"/>
+    <w:bookmarkEnd w:id="117"/>
+    <w:bookmarkEnd w:id="118"/>
+    <w:bookmarkStart w:id="131" w:name="cierre-consolida-lo-aprendido"/>
     <w:p>
       <w:pPr>
         <w:pStyle w:val="Heading1"/>
@@ -19545,7 +19478,7 @@
         </w:pict>
       </w:r>
     </w:p>
-    <w:bookmarkStart w:id="113" w:name="sé-el-paquete"/>
+    <w:bookmarkStart w:id="119" w:name="sé-el-paquete"/>
     <w:p>
       <w:pPr>
         <w:pStyle w:val="Heading2"/>
@@ -19742,8 +19675,8 @@
         </w:pict>
       </w:r>
     </w:p>
-    <w:bookmarkEnd w:id="113"/>
-    <w:bookmarkStart w:id="114" w:name="X4c05e95ba2909562a05eb03021c8f3ca9d0db7e"/>
+    <w:bookmarkEnd w:id="119"/>
+    <w:bookmarkStart w:id="120" w:name="X4c05e95ba2909562a05eb03021c8f3ca9d0db7e"/>
     <w:p>
       <w:pPr>
         <w:pStyle w:val="Heading2"/>
@@ -19915,8 +19848,8 @@
         </w:pict>
       </w:r>
     </w:p>
-    <w:bookmarkEnd w:id="114"/>
-    <w:bookmarkStart w:id="115" w:name="quién-soy"/>
+    <w:bookmarkEnd w:id="120"/>
+    <w:bookmarkStart w:id="121" w:name="quién-soy"/>
     <w:p>
       <w:pPr>
         <w:pStyle w:val="Heading2"/>
@@ -20072,8 +20005,8 @@
         </w:pict>
       </w:r>
     </w:p>
-    <w:bookmarkEnd w:id="115"/>
-    <w:bookmarkStart w:id="116" w:name="X8fd3dc292930e4585d698fce951e3ba762683aa"/>
+    <w:bookmarkEnd w:id="121"/>
+    <w:bookmarkStart w:id="122" w:name="X8fd3dc292930e4585d698fce951e3ba762683aa"/>
     <w:p>
       <w:pPr>
         <w:pStyle w:val="Heading2"/>
@@ -20173,8 +20106,8 @@
         </w:pict>
       </w:r>
     </w:p>
-    <w:bookmarkEnd w:id="116"/>
-    <w:bookmarkStart w:id="117" w:name="X27d7fd53c7e2f4585b647b45ae5a51903fb4532"/>
+    <w:bookmarkEnd w:id="122"/>
+    <w:bookmarkStart w:id="123" w:name="X27d7fd53c7e2f4585b647b45ae5a51903fb4532"/>
     <w:p>
       <w:pPr>
         <w:pStyle w:val="Heading2"/>
@@ -20615,8 +20548,8 @@
         </w:pict>
       </w:r>
     </w:p>
-    <w:bookmarkEnd w:id="117"/>
-    <w:bookmarkStart w:id="118" w:name="logros-de-esta-unidad"/>
+    <w:bookmarkEnd w:id="123"/>
+    <w:bookmarkStart w:id="124" w:name="logros-de-esta-unidad"/>
     <w:p>
       <w:pPr>
         <w:pStyle w:val="Heading2"/>
@@ -20827,8 +20760,8 @@
         </w:pict>
       </w:r>
     </w:p>
-    <w:bookmarkEnd w:id="118"/>
-    <w:bookmarkStart w:id="119" w:name="atrévete-a-pensar"/>
+    <w:bookmarkEnd w:id="124"/>
+    <w:bookmarkStart w:id="125" w:name="atrévete-a-pensar"/>
     <w:p>
       <w:pPr>
         <w:pStyle w:val="Heading2"/>
@@ -21106,8 +21039,8 @@
         </w:pict>
       </w:r>
     </w:p>
-    <w:bookmarkEnd w:id="119"/>
-    <w:bookmarkStart w:id="120" w:name="crucigrama-de-bits"/>
+    <w:bookmarkEnd w:id="125"/>
+    <w:bookmarkStart w:id="126" w:name="crucigrama-de-bits"/>
     <w:p>
       <w:pPr>
         <w:pStyle w:val="Heading2"/>
@@ -21253,8 +21186,8 @@
         </w:pict>
       </w:r>
     </w:p>
-    <w:bookmarkEnd w:id="120"/>
-    <w:bookmarkStart w:id="121" w:name="preguntas-de-entrevista-de-trabajo"/>
+    <w:bookmarkEnd w:id="126"/>
+    <w:bookmarkStart w:id="127" w:name="preguntas-de-entrevista-de-trabajo"/>
     <w:p>
       <w:pPr>
         <w:pStyle w:val="Heading2"/>
@@ -21466,8 +21399,8 @@
         </w:pict>
       </w:r>
     </w:p>
-    <w:bookmarkEnd w:id="121"/>
-    <w:bookmarkStart w:id="122" w:name="no-hay-preguntas-tontas"/>
+    <w:bookmarkEnd w:id="127"/>
+    <w:bookmarkStart w:id="128" w:name="no-hay-preguntas-tontas"/>
     <w:p>
       <w:pPr>
         <w:pStyle w:val="Heading2"/>
@@ -21699,8 +21632,8 @@
         </w:pict>
       </w:r>
     </w:p>
-    <w:bookmarkEnd w:id="122"/>
-    <w:bookmarkStart w:id="123" w:name="poscréditos"/>
+    <w:bookmarkEnd w:id="128"/>
+    <w:bookmarkStart w:id="129" w:name="poscréditos"/>
     <w:p>
       <w:pPr>
         <w:pStyle w:val="Heading2"/>
@@ -21766,8 +21699,8 @@
         </w:pict>
       </w:r>
     </w:p>
-    <w:bookmarkEnd w:id="123"/>
-    <w:bookmarkStart w:id="124" w:name="Xd243717b49c447ac6bd68a31cbf449a20a4941d"/>
+    <w:bookmarkEnd w:id="129"/>
+    <w:bookmarkStart w:id="130" w:name="Xd243717b49c447ac6bd68a31cbf449a20a4941d"/>
     <w:p>
       <w:pPr>
         <w:pStyle w:val="Heading2"/>
@@ -22100,7 +22033,7 @@
       <w:r>
         <w:t xml:space="preserve"> </w:t>
       </w:r>
-      <w:hyperlink r:id="rId46">
+      <w:hyperlink r:id="rId49">
         <w:r>
           <w:rPr>
             <w:rStyle w:val="Hyperlink"/>
@@ -22163,8 +22096,8 @@
         </w:r>
       </w:hyperlink>
     </w:p>
-    <w:bookmarkEnd w:id="124"/>
-    <w:bookmarkEnd w:id="125"/>
+    <w:bookmarkEnd w:id="130"/>
+    <w:bookmarkEnd w:id="131"/>
     <w:sectPr/>
   </w:body>
 </w:document>

</xml_diff>